<commit_message>
moved analysis to another repo
</commit_message>
<xml_diff>
--- a/ms-2026-08-13v2.docx
+++ b/ms-2026-08-13v2.docx
@@ -1517,11 +1517,7 @@
       <w:bookmarkEnd w:id="14"/>
       <w:r>
         <w:rPr/>
-        <w:t xml:space="preserve"> and 26 were not previously described to our knowlege (Table 1). We also carried out signature discovery in spectra in the 83-type classification, and discovered 34 signatures, of which 20 were similar to signatures in the COSMIC reference set, and 3 additional signatures were similar to signatures identifi</w:t>
-      </w:r>
-      <w:r>
-        <w:rPr/>
-        <w:t xml:space="preserve">ed in </w:t>
+        <w:t xml:space="preserve"> and 26 were not previously described to our knowlege (Table 1). We also carried out signature discovery in spectra in the 83-type classification, and discovered 34 signatures, of which 20 were similar to signatures in the COSMIC reference set, and 3 additional signatures were similar to signatures identified in </w:t>
       </w:r>
       <w:bookmarkStart w:id="15" w:name="ZOTERO_BREF_qtuc1qdBuTrl"/>
       <w:r>
@@ -1531,11 +1527,7 @@
       <w:bookmarkEnd w:id="15"/>
       <w:r>
         <w:rPr/>
-        <w:t xml:space="preserve">  (T</w:t>
-      </w:r>
-      <w:r>
-        <w:rPr/>
-        <w:t>able 1).</w:t>
+        <w:t xml:space="preserve">  (Table 1).</w:t>
       </w:r>
     </w:p>
     <w:p>
@@ -2145,19 +2137,7 @@
         <w:rPr>
           <w:rFonts w:eastAsia="Times New Roman"/>
         </w:rPr>
-        <w:t xml:space="preserve">, who denoted it InD9a. </w:t>
-      </w:r>
-      <w:r>
-        <w:rPr>
-          <w:rFonts w:eastAsia="Times New Roman"/>
-        </w:rPr>
-        <w:t>W</w:t>
-      </w:r>
-      <w:r>
-        <w:rPr>
-          <w:rFonts w:eastAsia="Times New Roman"/>
-        </w:rPr>
-        <w:t xml:space="preserve">e propose that this signature is distinct enough from InsDel9 in the 476-type classification to warrant an identifier.  </w:t>
+        <w:t xml:space="preserve">, who denoted it InD9a. We propose that this signature is distinct enough from InsDel9 in the 476-type classification to warrant an identifier.  </w:t>
       </w:r>
     </w:p>
     <w:p>
@@ -2176,18 +2156,7 @@
           <w:iCs/>
           <w:shd w:fill="auto" w:val="clear"/>
         </w:rPr>
-        <w:t>New signatures with similar proportions of deletions and insertions of a single T in poly-T tract</w:t>
-      </w:r>
-      <w:r>
-        <w:rPr>
-          <w:rFonts w:eastAsia="Times New Roman" w:hint="eastAsia"/>
-          <w:b/>
-          <w:bCs/>
-          <w:i/>
-          <w:iCs/>
-          <w:shd w:fill="auto" w:val="clear"/>
-        </w:rPr>
-        <w:t>s</w:t>
+        <w:t>New signatures with similar proportions of deletions and insertions of a single T in poly-T tracts</w:t>
       </w:r>
     </w:p>
     <w:p>
@@ -2230,11 +2199,7 @@
       </w:pPr>
       <w:r>
         <w:rPr/>
-        <w:t>The n</w:t>
-      </w:r>
-      <w:r>
-        <w:rPr/>
-        <w:t>ew indel classifications reveal an accurate signature of RNase H2 deficiency</w:t>
+        <w:t>The new indel classifications reveal an accurate signature of RNase H2 deficiency</w:t>
       </w:r>
     </w:p>
     <w:p>
@@ -2259,26 +2224,45 @@
       </w:r>
       <w:r>
         <w:rPr>
-          <w:shd w:fill="FFFF00" w:val="clear"/>
+          <w:shd w:fill="00FFFF" w:val="clear"/>
         </w:rPr>
         <w:t>(Figure</w:t>
       </w:r>
       <w:r>
         <w:rPr>
+          <w:shd w:fill="00FFFF" w:val="clear"/>
+        </w:rPr>
+        <w:t>s</w:t>
+      </w:r>
+      <w:r>
+        <w:rPr>
           <w:rFonts w:eastAsia="Times New Roman" w:hint="eastAsia"/>
-          <w:shd w:fill="FFFF00" w:val="clear"/>
-        </w:rPr>
-        <w:t xml:space="preserve"> 6</w:t>
-      </w:r>
-      <w:r>
-        <w:rPr>
-          <w:shd w:fill="FFFF00" w:val="clear"/>
+          <w:shd w:fill="00FFFF" w:val="clear"/>
+        </w:rPr>
+        <w:t xml:space="preserve"> 6, </w:t>
+      </w:r>
+      <w:r>
+        <w:rPr>
+          <w:rFonts w:eastAsia="Times New Roman" w:hint="eastAsia"/>
+          <w:shd w:fill="00FFFF" w:val="clear"/>
+        </w:rPr>
+        <w:t>S5</w:t>
+      </w:r>
+      <w:r>
+        <w:rPr>
+          <w:shd w:fill="00FFFF" w:val="clear"/>
         </w:rPr>
         <w:t>)</w:t>
       </w:r>
       <w:r>
-        <w:rPr/>
-        <w:t xml:space="preserve">. The profile of deletions of </w:t>
+        <w:rPr>
+          <w:shd w:fill="00FFFF" w:val="clear"/>
+        </w:rPr>
+        <w:t>.</w:t>
+      </w:r>
+      <w:r>
+        <w:rPr/>
+        <w:t xml:space="preserve"> The profile of deletions of </w:t>
       </w:r>
       <w:r>
         <w:rPr>
@@ -20741,7 +20725,7 @@
   <w:comment w:id="0" w:author="Mo Liu" w:date="2026-06-29T16:59:00Z" w:initials="ML">
     <w:p>
       <w:pPr>
-        <w:overflowPunct w:val="false"/>
+        <w:overflowPunct w:val="true"/>
         <w:spacing w:lineRule="auto" w:line="240" w:before="0" w:after="0"/>
         <w:rPr/>
       </w:pPr>
@@ -20761,7 +20745,7 @@
   <w:comment w:id="4" w:author="Mo Liu" w:date="2026-05-25T13:45:00Z" w:initials="ML">
     <w:p>
       <w:pPr>
-        <w:overflowPunct w:val="true"/>
+        <w:overflowPunct w:val="false"/>
         <w:spacing w:lineRule="auto" w:line="240" w:before="0" w:after="0"/>
         <w:rPr/>
       </w:pPr>
@@ -20781,7 +20765,7 @@
   <w:comment w:id="3" w:author="Steve Rozen, Ph.D." w:date="2026-05-28T17:52:00Z" w:initials="SR">
     <w:p>
       <w:pPr>
-        <w:overflowPunct w:val="true"/>
+        <w:overflowPunct w:val="false"/>
         <w:spacing w:lineRule="auto" w:line="240" w:before="0" w:after="0"/>
         <w:rPr/>
       </w:pPr>
@@ -20801,7 +20785,7 @@
   <w:comment w:id="2" w:author="Mo Liu" w:date="2026-05-29T16:03:00Z" w:initials="ML">
     <w:p>
       <w:pPr>
-        <w:overflowPunct w:val="false"/>
+        <w:overflowPunct w:val="true"/>
         <w:spacing w:lineRule="auto" w:line="240" w:before="0" w:after="0"/>
         <w:rPr/>
       </w:pPr>
@@ -20821,7 +20805,7 @@
   <w:comment w:id="1" w:author="Unknown Author" w:date="2026-07-02T20:23:00Z" w:initials="">
     <w:p>
       <w:pPr>
-        <w:overflowPunct w:val="false"/>
+        <w:overflowPunct w:val="true"/>
         <w:spacing w:lineRule="auto" w:line="240" w:before="0" w:after="0"/>
         <w:rPr/>
       </w:pPr>
@@ -20840,8 +20824,8 @@
     </w:p>
     <w:p>
       <w:pPr>
-        <w:overflowPunct w:val="false"/>
-        <w:spacing w:lineRule="auto" w:line="240" w:before="12109" w:after="0"/>
+        <w:overflowPunct w:val="true"/>
+        <w:spacing w:lineRule="auto" w:line="240" w:before="21359" w:after="0"/>
         <w:rPr/>
       </w:pPr>
       <w:r>
@@ -20855,8 +20839,8 @@
     </w:p>
     <w:p>
       <w:pPr>
-        <w:overflowPunct w:val="false"/>
-        <w:spacing w:lineRule="auto" w:line="240" w:before="12109" w:after="0"/>
+        <w:overflowPunct w:val="true"/>
+        <w:spacing w:lineRule="auto" w:line="240" w:before="21359" w:after="0"/>
         <w:rPr/>
       </w:pPr>
       <w:r>
@@ -20869,8 +20853,8 @@
     </w:p>
     <w:p>
       <w:pPr>
-        <w:overflowPunct w:val="false"/>
-        <w:spacing w:lineRule="auto" w:line="240" w:before="12109" w:after="0"/>
+        <w:overflowPunct w:val="true"/>
+        <w:spacing w:lineRule="auto" w:line="240" w:before="21359" w:after="0"/>
         <w:rPr/>
       </w:pPr>
       <w:r>
@@ -20884,8 +20868,8 @@
     </w:p>
     <w:p>
       <w:pPr>
-        <w:overflowPunct w:val="false"/>
-        <w:spacing w:lineRule="auto" w:line="240" w:before="12109" w:after="0"/>
+        <w:overflowPunct w:val="true"/>
+        <w:spacing w:lineRule="auto" w:line="240" w:before="21359" w:after="0"/>
         <w:rPr/>
       </w:pPr>
       <w:r>
@@ -20898,8 +20882,8 @@
     </w:p>
     <w:p>
       <w:pPr>
-        <w:overflowPunct w:val="false"/>
-        <w:spacing w:lineRule="auto" w:line="240" w:before="12109" w:after="0"/>
+        <w:overflowPunct w:val="true"/>
+        <w:spacing w:lineRule="auto" w:line="240" w:before="21359" w:after="0"/>
         <w:rPr/>
       </w:pPr>
       <w:r>
@@ -20913,8 +20897,8 @@
     </w:p>
     <w:p>
       <w:pPr>
-        <w:overflowPunct w:val="false"/>
-        <w:spacing w:lineRule="auto" w:line="240" w:before="12109" w:after="0"/>
+        <w:overflowPunct w:val="true"/>
+        <w:spacing w:lineRule="auto" w:line="240" w:before="21359" w:after="0"/>
         <w:rPr/>
       </w:pPr>
       <w:r>
@@ -20927,8 +20911,8 @@
     </w:p>
     <w:p>
       <w:pPr>
-        <w:overflowPunct w:val="false"/>
-        <w:spacing w:lineRule="auto" w:line="240" w:before="12109" w:after="0"/>
+        <w:overflowPunct w:val="true"/>
+        <w:spacing w:lineRule="auto" w:line="240" w:before="21359" w:after="0"/>
         <w:rPr/>
       </w:pPr>
       <w:r>
@@ -20942,8 +20926,8 @@
     </w:p>
     <w:p>
       <w:pPr>
-        <w:overflowPunct w:val="false"/>
-        <w:spacing w:lineRule="auto" w:line="240" w:before="12109" w:after="0"/>
+        <w:overflowPunct w:val="true"/>
+        <w:spacing w:lineRule="auto" w:line="240" w:before="21359" w:after="0"/>
         <w:rPr/>
       </w:pPr>
       <w:r>
@@ -20956,8 +20940,8 @@
     </w:p>
     <w:p>
       <w:pPr>
-        <w:overflowPunct w:val="false"/>
-        <w:spacing w:lineRule="auto" w:line="240" w:before="12109" w:after="0"/>
+        <w:overflowPunct w:val="true"/>
+        <w:spacing w:lineRule="auto" w:line="240" w:before="21359" w:after="0"/>
         <w:rPr/>
       </w:pPr>
       <w:r>
@@ -20971,8 +20955,8 @@
     </w:p>
     <w:p>
       <w:pPr>
-        <w:overflowPunct w:val="false"/>
-        <w:spacing w:lineRule="auto" w:line="240" w:before="12109" w:after="0"/>
+        <w:overflowPunct w:val="true"/>
+        <w:spacing w:lineRule="auto" w:line="240" w:before="21359" w:after="0"/>
         <w:rPr/>
       </w:pPr>
       <w:r>
@@ -20986,8 +20970,8 @@
     </w:p>
     <w:p>
       <w:pPr>
-        <w:overflowPunct w:val="false"/>
-        <w:spacing w:lineRule="auto" w:line="240" w:before="12109" w:after="0"/>
+        <w:overflowPunct w:val="true"/>
+        <w:spacing w:lineRule="auto" w:line="240" w:before="21359" w:after="0"/>
         <w:rPr/>
       </w:pPr>
       <w:r>
@@ -21001,8 +20985,8 @@
     </w:p>
     <w:p>
       <w:pPr>
-        <w:overflowPunct w:val="false"/>
-        <w:spacing w:lineRule="auto" w:line="240" w:before="12109" w:after="0"/>
+        <w:overflowPunct w:val="true"/>
+        <w:spacing w:lineRule="auto" w:line="240" w:before="21359" w:after="0"/>
         <w:rPr/>
       </w:pPr>
       <w:r>
@@ -21015,8 +20999,8 @@
     </w:p>
     <w:p>
       <w:pPr>
-        <w:overflowPunct w:val="false"/>
-        <w:spacing w:lineRule="auto" w:line="240" w:before="12109" w:after="0"/>
+        <w:overflowPunct w:val="true"/>
+        <w:spacing w:lineRule="auto" w:line="240" w:before="21359" w:after="0"/>
         <w:rPr/>
       </w:pPr>
       <w:r>
@@ -21029,8 +21013,8 @@
     </w:p>
     <w:p>
       <w:pPr>
-        <w:overflowPunct w:val="false"/>
-        <w:spacing w:lineRule="auto" w:line="240" w:before="12109" w:after="0"/>
+        <w:overflowPunct w:val="true"/>
+        <w:spacing w:lineRule="auto" w:line="240" w:before="21359" w:after="0"/>
         <w:rPr/>
       </w:pPr>
       <w:r>
@@ -21043,8 +21027,8 @@
     </w:p>
     <w:p>
       <w:pPr>
-        <w:overflowPunct w:val="false"/>
-        <w:spacing w:lineRule="auto" w:line="240" w:before="12109" w:after="0"/>
+        <w:overflowPunct w:val="true"/>
+        <w:spacing w:lineRule="auto" w:line="240" w:before="21359" w:after="0"/>
         <w:rPr/>
       </w:pPr>
       <w:r>
@@ -21057,8 +21041,8 @@
     </w:p>
     <w:p>
       <w:pPr>
-        <w:overflowPunct w:val="false"/>
-        <w:spacing w:lineRule="auto" w:line="240" w:before="12109" w:after="0"/>
+        <w:overflowPunct w:val="true"/>
+        <w:spacing w:lineRule="auto" w:line="240" w:before="21359" w:after="0"/>
         <w:rPr/>
       </w:pPr>
       <w:r>
@@ -21071,8 +21055,8 @@
     </w:p>
     <w:p>
       <w:pPr>
-        <w:overflowPunct w:val="false"/>
-        <w:spacing w:lineRule="auto" w:line="240" w:before="12109" w:after="0"/>
+        <w:overflowPunct w:val="true"/>
+        <w:spacing w:lineRule="auto" w:line="240" w:before="21359" w:after="0"/>
         <w:rPr/>
       </w:pPr>
       <w:r>
@@ -21085,8 +21069,8 @@
     </w:p>
     <w:p>
       <w:pPr>
-        <w:overflowPunct w:val="false"/>
-        <w:spacing w:lineRule="auto" w:line="240" w:before="12109" w:after="0"/>
+        <w:overflowPunct w:val="true"/>
+        <w:spacing w:lineRule="auto" w:line="240" w:before="21359" w:after="0"/>
         <w:rPr/>
       </w:pPr>
       <w:r>
@@ -21100,8 +21084,8 @@
     </w:p>
     <w:p>
       <w:pPr>
-        <w:overflowPunct w:val="false"/>
-        <w:spacing w:lineRule="auto" w:line="240" w:before="12109" w:after="0"/>
+        <w:overflowPunct w:val="true"/>
+        <w:spacing w:lineRule="auto" w:line="240" w:before="21359" w:after="0"/>
         <w:rPr/>
       </w:pPr>
       <w:r>
@@ -21114,8 +21098,8 @@
     </w:p>
     <w:p>
       <w:pPr>
-        <w:overflowPunct w:val="false"/>
-        <w:spacing w:lineRule="auto" w:line="240" w:before="12109" w:after="0"/>
+        <w:overflowPunct w:val="true"/>
+        <w:spacing w:lineRule="auto" w:line="240" w:before="21359" w:after="0"/>
         <w:rPr/>
       </w:pPr>
       <w:r>
@@ -21128,8 +21112,8 @@
     </w:p>
     <w:p>
       <w:pPr>
-        <w:overflowPunct w:val="false"/>
-        <w:spacing w:lineRule="auto" w:line="240" w:before="12109" w:after="0"/>
+        <w:overflowPunct w:val="true"/>
+        <w:spacing w:lineRule="auto" w:line="240" w:before="21359" w:after="0"/>
         <w:rPr/>
       </w:pPr>
       <w:r>
@@ -21142,8 +21126,8 @@
     </w:p>
     <w:p>
       <w:pPr>
-        <w:overflowPunct w:val="false"/>
-        <w:spacing w:lineRule="auto" w:line="240" w:before="12109" w:after="0"/>
+        <w:overflowPunct w:val="true"/>
+        <w:spacing w:lineRule="auto" w:line="240" w:before="21359" w:after="0"/>
         <w:rPr/>
       </w:pPr>
       <w:r>
@@ -21156,8 +21140,8 @@
     </w:p>
     <w:p>
       <w:pPr>
-        <w:overflowPunct w:val="false"/>
-        <w:spacing w:lineRule="auto" w:line="240" w:before="12109" w:after="0"/>
+        <w:overflowPunct w:val="true"/>
+        <w:spacing w:lineRule="auto" w:line="240" w:before="21359" w:after="0"/>
         <w:rPr/>
       </w:pPr>
       <w:r>
@@ -21170,8 +21154,8 @@
     </w:p>
     <w:p>
       <w:pPr>
-        <w:overflowPunct w:val="false"/>
-        <w:spacing w:lineRule="auto" w:line="240" w:before="12109" w:after="0"/>
+        <w:overflowPunct w:val="true"/>
+        <w:spacing w:lineRule="auto" w:line="240" w:before="21359" w:after="0"/>
         <w:rPr/>
       </w:pPr>
       <w:r>
@@ -21184,8 +21168,8 @@
     </w:p>
     <w:p>
       <w:pPr>
-        <w:overflowPunct w:val="false"/>
-        <w:spacing w:lineRule="auto" w:line="240" w:before="12109" w:after="0"/>
+        <w:overflowPunct w:val="true"/>
+        <w:spacing w:lineRule="auto" w:line="240" w:before="21359" w:after="0"/>
         <w:rPr/>
       </w:pPr>
       <w:r>
@@ -21198,8 +21182,8 @@
     </w:p>
     <w:p>
       <w:pPr>
-        <w:overflowPunct w:val="false"/>
-        <w:spacing w:lineRule="auto" w:line="240" w:before="12109" w:after="0"/>
+        <w:overflowPunct w:val="true"/>
+        <w:spacing w:lineRule="auto" w:line="240" w:before="21359" w:after="0"/>
         <w:rPr/>
       </w:pPr>
       <w:r>
@@ -21212,8 +21196,8 @@
     </w:p>
     <w:p>
       <w:pPr>
-        <w:overflowPunct w:val="false"/>
-        <w:spacing w:lineRule="auto" w:line="240" w:before="12109" w:after="0"/>
+        <w:overflowPunct w:val="true"/>
+        <w:spacing w:lineRule="auto" w:line="240" w:before="21359" w:after="0"/>
         <w:rPr/>
       </w:pPr>
       <w:r>
@@ -21226,8 +21210,8 @@
     </w:p>
     <w:p>
       <w:pPr>
-        <w:overflowPunct w:val="false"/>
-        <w:spacing w:lineRule="auto" w:line="240" w:before="12109" w:after="0"/>
+        <w:overflowPunct w:val="true"/>
+        <w:spacing w:lineRule="auto" w:line="240" w:before="21359" w:after="0"/>
         <w:rPr/>
       </w:pPr>
       <w:r>
@@ -21240,8 +21224,8 @@
     </w:p>
     <w:p>
       <w:pPr>
-        <w:overflowPunct w:val="false"/>
-        <w:spacing w:lineRule="auto" w:line="240" w:before="12109" w:after="0"/>
+        <w:overflowPunct w:val="true"/>
+        <w:spacing w:lineRule="auto" w:line="240" w:before="21359" w:after="0"/>
         <w:rPr/>
       </w:pPr>
       <w:r>
@@ -21254,8 +21238,8 @@
     </w:p>
     <w:p>
       <w:pPr>
-        <w:overflowPunct w:val="false"/>
-        <w:spacing w:lineRule="auto" w:line="240" w:before="12109" w:after="0"/>
+        <w:overflowPunct w:val="true"/>
+        <w:spacing w:lineRule="auto" w:line="240" w:before="21359" w:after="0"/>
         <w:rPr/>
       </w:pPr>
       <w:r>
@@ -21268,8 +21252,8 @@
     </w:p>
     <w:p>
       <w:pPr>
-        <w:overflowPunct w:val="false"/>
-        <w:spacing w:lineRule="auto" w:line="240" w:before="12109" w:after="0"/>
+        <w:overflowPunct w:val="true"/>
+        <w:spacing w:lineRule="auto" w:line="240" w:before="21359" w:after="0"/>
         <w:rPr/>
       </w:pPr>
       <w:r>
@@ -21282,8 +21266,8 @@
     </w:p>
     <w:p>
       <w:pPr>
-        <w:overflowPunct w:val="false"/>
-        <w:spacing w:lineRule="auto" w:line="240" w:before="12109" w:after="0"/>
+        <w:overflowPunct w:val="true"/>
+        <w:spacing w:lineRule="auto" w:line="240" w:before="21359" w:after="0"/>
         <w:rPr/>
       </w:pPr>
       <w:r>
@@ -21296,8 +21280,8 @@
     </w:p>
     <w:p>
       <w:pPr>
-        <w:overflowPunct w:val="false"/>
-        <w:spacing w:lineRule="auto" w:line="240" w:before="12109" w:after="0"/>
+        <w:overflowPunct w:val="true"/>
+        <w:spacing w:lineRule="auto" w:line="240" w:before="21359" w:after="0"/>
         <w:rPr/>
       </w:pPr>
       <w:r>
@@ -21310,8 +21294,8 @@
     </w:p>
     <w:p>
       <w:pPr>
-        <w:overflowPunct w:val="false"/>
-        <w:spacing w:lineRule="auto" w:line="240" w:before="12109" w:after="0"/>
+        <w:overflowPunct w:val="true"/>
+        <w:spacing w:lineRule="auto" w:line="240" w:before="21359" w:after="0"/>
         <w:rPr/>
       </w:pPr>
       <w:r>
@@ -21324,8 +21308,8 @@
     </w:p>
     <w:p>
       <w:pPr>
-        <w:overflowPunct w:val="false"/>
-        <w:spacing w:lineRule="auto" w:line="240" w:before="12109" w:after="0"/>
+        <w:overflowPunct w:val="true"/>
+        <w:spacing w:lineRule="auto" w:line="240" w:before="21359" w:after="0"/>
         <w:rPr/>
       </w:pPr>
       <w:r>
@@ -21338,8 +21322,8 @@
     </w:p>
     <w:p>
       <w:pPr>
-        <w:overflowPunct w:val="false"/>
-        <w:spacing w:lineRule="auto" w:line="240" w:before="12109" w:after="0"/>
+        <w:overflowPunct w:val="true"/>
+        <w:spacing w:lineRule="auto" w:line="240" w:before="21359" w:after="0"/>
         <w:rPr/>
       </w:pPr>
       <w:r>
@@ -21352,8 +21336,8 @@
     </w:p>
     <w:p>
       <w:pPr>
-        <w:overflowPunct w:val="false"/>
-        <w:spacing w:lineRule="auto" w:line="240" w:before="12109" w:after="0"/>
+        <w:overflowPunct w:val="true"/>
+        <w:spacing w:lineRule="auto" w:line="240" w:before="21359" w:after="0"/>
         <w:rPr/>
       </w:pPr>
       <w:r>
@@ -21366,8 +21350,8 @@
     </w:p>
     <w:p>
       <w:pPr>
-        <w:overflowPunct w:val="false"/>
-        <w:spacing w:lineRule="auto" w:line="240" w:before="12109" w:after="0"/>
+        <w:overflowPunct w:val="true"/>
+        <w:spacing w:lineRule="auto" w:line="240" w:before="21359" w:after="0"/>
         <w:rPr/>
       </w:pPr>
       <w:r>
@@ -21380,8 +21364,8 @@
     </w:p>
     <w:p>
       <w:pPr>
-        <w:overflowPunct w:val="false"/>
-        <w:spacing w:lineRule="auto" w:line="240" w:before="12109" w:after="0"/>
+        <w:overflowPunct w:val="true"/>
+        <w:spacing w:lineRule="auto" w:line="240" w:before="21359" w:after="0"/>
         <w:rPr/>
       </w:pPr>
       <w:r>
@@ -21394,8 +21378,8 @@
     </w:p>
     <w:p>
       <w:pPr>
-        <w:overflowPunct w:val="false"/>
-        <w:spacing w:lineRule="auto" w:line="240" w:before="12109" w:after="0"/>
+        <w:overflowPunct w:val="true"/>
+        <w:spacing w:lineRule="auto" w:line="240" w:before="21359" w:after="0"/>
         <w:rPr/>
       </w:pPr>
       <w:r>
@@ -21408,8 +21392,8 @@
     </w:p>
     <w:p>
       <w:pPr>
-        <w:overflowPunct w:val="false"/>
-        <w:spacing w:lineRule="auto" w:line="240" w:before="12109" w:after="0"/>
+        <w:overflowPunct w:val="true"/>
+        <w:spacing w:lineRule="auto" w:line="240" w:before="21359" w:after="0"/>
         <w:rPr/>
       </w:pPr>
       <w:r>
@@ -21422,8 +21406,8 @@
     </w:p>
     <w:p>
       <w:pPr>
-        <w:overflowPunct w:val="false"/>
-        <w:spacing w:lineRule="auto" w:line="240" w:before="12109" w:after="0"/>
+        <w:overflowPunct w:val="true"/>
+        <w:spacing w:lineRule="auto" w:line="240" w:before="21359" w:after="0"/>
         <w:rPr/>
       </w:pPr>
       <w:r>
@@ -21436,8 +21420,8 @@
     </w:p>
     <w:p>
       <w:pPr>
-        <w:overflowPunct w:val="false"/>
-        <w:spacing w:lineRule="auto" w:line="240" w:before="12109" w:after="0"/>
+        <w:overflowPunct w:val="true"/>
+        <w:spacing w:lineRule="auto" w:line="240" w:before="21359" w:after="0"/>
         <w:rPr/>
       </w:pPr>
       <w:r>
@@ -21450,8 +21434,8 @@
     </w:p>
     <w:p>
       <w:pPr>
-        <w:overflowPunct w:val="false"/>
-        <w:spacing w:lineRule="auto" w:line="240" w:before="12109" w:after="0"/>
+        <w:overflowPunct w:val="true"/>
+        <w:spacing w:lineRule="auto" w:line="240" w:before="21359" w:after="0"/>
         <w:rPr/>
       </w:pPr>
       <w:r>
@@ -22577,8 +22561,8 @@
       <w:szCs w:val="24"/>
     </w:rPr>
   </w:style>
-  <w:style w:type="character" w:styleId="Bullets" w:customStyle="1">
-    <w:name w:val="Bullets"/>
+  <w:style w:type="character" w:styleId="Bulletsuser" w:customStyle="1">
+    <w:name w:val="Bullets (user)"/>
     <w:qFormat/>
     <w:rPr>
       <w:rFonts w:ascii="OpenSymbol" w:hAnsi="OpenSymbol" w:eastAsia="OpenSymbol" w:cs="OpenSymbol"/>

</xml_diff>